<commit_message>
Documento de revisão em Word por caso, imagens otimizadas e prompt da IMG-001-C
- npm run documentos:revisao gera docs/casos/word/CASO-NNN-revisao.docx: o caso como o aluno recebe,
  cada decisão com alternativas, classificação, destino, consequência e explicação, desfechos,
  discussão, nota, imagens embutidas e pontos para validação
- Estilo do Word em scripts/word-comum.mjs, usado pelos dois geradores
- Imagens de exame com até 2000 px (de 25 MB para 4,5 MB no total)
- Pendências atualizadas com as decisões desta revisão
- Prompt v4 da IMG-001-C: contraste retido no delgado, sem chegar ao cólon

Co-Authored-By: Claude Opus 5.5 <noreply@anthropic.com>
</commit_message>
<xml_diff>
--- a/docs/casos/word/CASO-001-caso-clinico.docx
+++ b/docs/casos/word/CASO-001-caso-clinico.docx
@@ -323,7 +323,7 @@
           </w:tcPr>
           <w:p>
             <w:r>
-              <w:t xml:space="preserve">1.4</w:t>
+              <w:t xml:space="preserve">1.5</w:t>
             </w:r>
           </w:p>
         </w:tc>
@@ -3578,7 +3578,7 @@
         <w:spacing w:after="120"/>
       </w:pPr>
       <w:r>
-        <w:t xml:space="preserve">A sonda nasogástrica, se passada, drenou 600 mL de conteúdo bilioso. A dor está em 4/10.</w:t>
+        <w:t xml:space="preserve">Uma hora depois da admissão, o paciente está mais confortável. A sonda nasogástrica aberta já drenou 600 mL de conteúdo bilioso, e a dor está em 4/10.</w:t>
       </w:r>
     </w:p>
     <w:tbl>
@@ -3916,7 +3916,7 @@
         <w:spacing w:after="120"/>
       </w:pPr>
       <w:r>
-        <w:t xml:space="preserve">A dor se tornou contínua, em 8/10, mais intensa no hipogástrio. O abdome está mais distendido, com defesa localizada no hipogástrio e descompressão dolorosa duvidosa. A sonda nasogástrica, se mantida, drenou 1.400 mL em 24 horas e a diurese está em 0,4 mL/kg/h.</w:t>
+        <w:t xml:space="preserve">A dor se tornou contínua, em 8/10, mais intensa no hipogástrio. O abdome está mais distendido, com defesa localizada no hipogástrio e descompressão dolorosa duvidosa. A sonda nasogástrica drenou 1.400 mL em 24 horas e a diurese está em 0,4 mL/kg/h.</w:t>
       </w:r>
     </w:p>
     <w:tbl>
@@ -6357,6 +6357,342 @@
           </w:p>
         </w:tc>
       </w:tr>
+      <w:tr>
+        <w:tc>
+          <w:tcPr>
+            <w:tcW w:type="dxa" w:w="786"/>
+            <w:tcBorders>
+              <w:top w:val="single" w:color="D8D8CF" w:sz="4"/>
+              <w:left w:val="single" w:color="D8D8CF" w:sz="4"/>
+              <w:bottom w:val="single" w:color="D8D8CF" w:sz="4"/>
+              <w:right w:val="single" w:color="D8D8CF" w:sz="4"/>
+            </w:tcBorders>
+            <w:tcMar>
+              <w:top w:type="dxa" w:w="80"/>
+              <w:left w:type="dxa" w:w="100"/>
+              <w:bottom w:type="dxa" w:w="80"/>
+              <w:right w:type="dxa" w:w="100"/>
+            </w:tcMar>
+          </w:tcPr>
+          <w:p>
+            <w:r>
+              <w:t xml:space="preserve">R13</w:t>
+            </w:r>
+          </w:p>
+        </w:tc>
+        <w:tc>
+          <w:tcPr>
+            <w:tcW w:type="dxa" w:w="983"/>
+            <w:tcBorders>
+              <w:top w:val="single" w:color="D8D8CF" w:sz="4"/>
+              <w:left w:val="single" w:color="D8D8CF" w:sz="4"/>
+              <w:bottom w:val="single" w:color="D8D8CF" w:sz="4"/>
+              <w:right w:val="single" w:color="D8D8CF" w:sz="4"/>
+            </w:tcBorders>
+            <w:tcMar>
+              <w:top w:type="dxa" w:w="80"/>
+              <w:left w:type="dxa" w:w="100"/>
+              <w:bottom w:type="dxa" w:w="80"/>
+              <w:right w:type="dxa" w:w="100"/>
+            </w:tcMar>
+          </w:tcPr>
+          <w:p>
+            <w:r>
+              <w:t xml:space="preserve">M4</w:t>
+            </w:r>
+          </w:p>
+        </w:tc>
+        <w:tc>
+          <w:tcPr>
+            <w:tcW w:type="dxa" w:w="2950"/>
+            <w:tcBorders>
+              <w:top w:val="single" w:color="D8D8CF" w:sz="4"/>
+              <w:left w:val="single" w:color="D8D8CF" w:sz="4"/>
+              <w:bottom w:val="single" w:color="D8D8CF" w:sz="4"/>
+              <w:right w:val="single" w:color="D8D8CF" w:sz="4"/>
+            </w:tcBorders>
+            <w:tcMar>
+              <w:top w:type="dxa" w:w="80"/>
+              <w:left w:type="dxa" w:w="100"/>
+              <w:bottom w:type="dxa" w:w="80"/>
+              <w:right w:type="dxa" w:w="100"/>
+            </w:tcMar>
+          </w:tcPr>
+          <w:p>
+            <w:r>
+              <w:t xml:space="preserve">Deixa o segmento inviável para reavaliar em reoperação programada.</w:t>
+            </w:r>
+          </w:p>
+        </w:tc>
+        <w:tc>
+          <w:tcPr>
+            <w:tcW w:type="dxa" w:w="2950"/>
+            <w:tcBorders>
+              <w:top w:val="single" w:color="D8D8CF" w:sz="4"/>
+              <w:left w:val="single" w:color="D8D8CF" w:sz="4"/>
+              <w:bottom w:val="single" w:color="D8D8CF" w:sz="4"/>
+              <w:right w:val="single" w:color="D8D8CF" w:sz="4"/>
+            </w:tcBorders>
+            <w:tcMar>
+              <w:top w:type="dxa" w:w="80"/>
+              <w:left w:type="dxa" w:w="100"/>
+              <w:bottom w:type="dxa" w:w="80"/>
+              <w:right w:type="dxa" w:w="100"/>
+            </w:tcMar>
+          </w:tcPr>
+          <w:p>
+            <w:r>
+              <w:t xml:space="preserve">Na reoperação, 24 horas depois, o segmento está necrótico e é ressecado com anastomose. O paciente passa por uma segunda anestesia e fica mais tempo internado.</w:t>
+            </w:r>
+          </w:p>
+        </w:tc>
+        <w:tc>
+          <w:tcPr>
+            <w:tcW w:type="dxa" w:w="1969"/>
+            <w:tcBorders>
+              <w:top w:val="single" w:color="D8D8CF" w:sz="4"/>
+              <w:left w:val="single" w:color="D8D8CF" w:sz="4"/>
+              <w:bottom w:val="single" w:color="D8D8CF" w:sz="4"/>
+              <w:right w:val="single" w:color="D8D8CF" w:sz="4"/>
+            </w:tcBorders>
+            <w:tcMar>
+              <w:top w:type="dxa" w:w="80"/>
+              <w:left w:type="dxa" w:w="100"/>
+              <w:bottom w:type="dxa" w:w="80"/>
+              <w:right w:type="dxa" w:w="100"/>
+            </w:tcMar>
+          </w:tcPr>
+          <w:p>
+            <w:r>
+              <w:t xml:space="preserve">M5, Pós-operatório</w:t>
+            </w:r>
+          </w:p>
+        </w:tc>
+      </w:tr>
+      <w:tr>
+        <w:tc>
+          <w:tcPr>
+            <w:tcW w:type="dxa" w:w="786"/>
+            <w:tcBorders>
+              <w:top w:val="single" w:color="D8D8CF" w:sz="4"/>
+              <w:left w:val="single" w:color="D8D8CF" w:sz="4"/>
+              <w:bottom w:val="single" w:color="D8D8CF" w:sz="4"/>
+              <w:right w:val="single" w:color="D8D8CF" w:sz="4"/>
+            </w:tcBorders>
+            <w:tcMar>
+              <w:top w:type="dxa" w:w="80"/>
+              <w:left w:type="dxa" w:w="100"/>
+              <w:bottom w:type="dxa" w:w="80"/>
+              <w:right w:type="dxa" w:w="100"/>
+            </w:tcMar>
+          </w:tcPr>
+          <w:p>
+            <w:r>
+              <w:t xml:space="preserve">R14</w:t>
+            </w:r>
+          </w:p>
+        </w:tc>
+        <w:tc>
+          <w:tcPr>
+            <w:tcW w:type="dxa" w:w="983"/>
+            <w:tcBorders>
+              <w:top w:val="single" w:color="D8D8CF" w:sz="4"/>
+              <w:left w:val="single" w:color="D8D8CF" w:sz="4"/>
+              <w:bottom w:val="single" w:color="D8D8CF" w:sz="4"/>
+              <w:right w:val="single" w:color="D8D8CF" w:sz="4"/>
+            </w:tcBorders>
+            <w:tcMar>
+              <w:top w:type="dxa" w:w="80"/>
+              <w:left w:type="dxa" w:w="100"/>
+              <w:bottom w:type="dxa" w:w="80"/>
+              <w:right w:type="dxa" w:w="100"/>
+            </w:tcMar>
+          </w:tcPr>
+          <w:p>
+            <w:r>
+              <w:t xml:space="preserve">M4-ALT</w:t>
+            </w:r>
+          </w:p>
+        </w:tc>
+        <w:tc>
+          <w:tcPr>
+            <w:tcW w:type="dxa" w:w="2950"/>
+            <w:tcBorders>
+              <w:top w:val="single" w:color="D8D8CF" w:sz="4"/>
+              <w:left w:val="single" w:color="D8D8CF" w:sz="4"/>
+              <w:bottom w:val="single" w:color="D8D8CF" w:sz="4"/>
+              <w:right w:val="single" w:color="D8D8CF" w:sz="4"/>
+            </w:tcBorders>
+            <w:tcMar>
+              <w:top w:type="dxa" w:w="80"/>
+              <w:left w:type="dxa" w:w="100"/>
+              <w:bottom w:type="dxa" w:w="80"/>
+              <w:right w:type="dxa" w:w="100"/>
+            </w:tcMar>
+          </w:tcPr>
+          <w:p>
+            <w:r>
+              <w:t xml:space="preserve">Faz anastomose primária em paciente em choque com acidose grave.</w:t>
+            </w:r>
+          </w:p>
+        </w:tc>
+        <w:tc>
+          <w:tcPr>
+            <w:tcW w:type="dxa" w:w="2950"/>
+            <w:tcBorders>
+              <w:top w:val="single" w:color="D8D8CF" w:sz="4"/>
+              <w:left w:val="single" w:color="D8D8CF" w:sz="4"/>
+              <w:bottom w:val="single" w:color="D8D8CF" w:sz="4"/>
+              <w:right w:val="single" w:color="D8D8CF" w:sz="4"/>
+            </w:tcBorders>
+            <w:tcMar>
+              <w:top w:type="dxa" w:w="80"/>
+              <w:left w:type="dxa" w:w="100"/>
+              <w:bottom w:type="dxa" w:w="80"/>
+              <w:right w:type="dxa" w:w="100"/>
+            </w:tcMar>
+          </w:tcPr>
+          <w:p>
+            <w:r>
+              <w:t xml:space="preserve">A cirurgia se estende para confeccionar a anastomose, e o paciente chega à UTI mais frio, mais acidótico e com dose maior de noradrenalina.</w:t>
+            </w:r>
+          </w:p>
+        </w:tc>
+        <w:tc>
+          <w:tcPr>
+            <w:tcW w:type="dxa" w:w="1969"/>
+            <w:tcBorders>
+              <w:top w:val="single" w:color="D8D8CF" w:sz="4"/>
+              <w:left w:val="single" w:color="D8D8CF" w:sz="4"/>
+              <w:bottom w:val="single" w:color="D8D8CF" w:sz="4"/>
+              <w:right w:val="single" w:color="D8D8CF" w:sz="4"/>
+            </w:tcBorders>
+            <w:tcMar>
+              <w:top w:type="dxa" w:w="80"/>
+              <w:left w:type="dxa" w:w="100"/>
+              <w:bottom w:type="dxa" w:w="80"/>
+              <w:right w:type="dxa" w:w="100"/>
+            </w:tcMar>
+          </w:tcPr>
+          <w:p>
+            <w:r>
+              <w:t xml:space="preserve">Desfecho D5 (grave)</w:t>
+            </w:r>
+          </w:p>
+        </w:tc>
+      </w:tr>
+      <w:tr>
+        <w:tc>
+          <w:tcPr>
+            <w:tcW w:type="dxa" w:w="786"/>
+            <w:tcBorders>
+              <w:top w:val="single" w:color="D8D8CF" w:sz="4"/>
+              <w:left w:val="single" w:color="D8D8CF" w:sz="4"/>
+              <w:bottom w:val="single" w:color="D8D8CF" w:sz="4"/>
+              <w:right w:val="single" w:color="D8D8CF" w:sz="4"/>
+            </w:tcBorders>
+            <w:tcMar>
+              <w:top w:type="dxa" w:w="80"/>
+              <w:left w:type="dxa" w:w="100"/>
+              <w:bottom w:type="dxa" w:w="80"/>
+              <w:right w:type="dxa" w:w="100"/>
+            </w:tcMar>
+          </w:tcPr>
+          <w:p>
+            <w:r>
+              <w:t xml:space="preserve">R15</w:t>
+            </w:r>
+          </w:p>
+        </w:tc>
+        <w:tc>
+          <w:tcPr>
+            <w:tcW w:type="dxa" w:w="983"/>
+            <w:tcBorders>
+              <w:top w:val="single" w:color="D8D8CF" w:sz="4"/>
+              <w:left w:val="single" w:color="D8D8CF" w:sz="4"/>
+              <w:bottom w:val="single" w:color="D8D8CF" w:sz="4"/>
+              <w:right w:val="single" w:color="D8D8CF" w:sz="4"/>
+            </w:tcBorders>
+            <w:tcMar>
+              <w:top w:type="dxa" w:w="80"/>
+              <w:left w:type="dxa" w:w="100"/>
+              <w:bottom w:type="dxa" w:w="80"/>
+              <w:right w:type="dxa" w:w="100"/>
+            </w:tcMar>
+          </w:tcPr>
+          <w:p>
+            <w:r>
+              <w:t xml:space="preserve">M4-ALT</w:t>
+            </w:r>
+          </w:p>
+        </w:tc>
+        <w:tc>
+          <w:tcPr>
+            <w:tcW w:type="dxa" w:w="2950"/>
+            <w:tcBorders>
+              <w:top w:val="single" w:color="D8D8CF" w:sz="4"/>
+              <w:left w:val="single" w:color="D8D8CF" w:sz="4"/>
+              <w:bottom w:val="single" w:color="D8D8CF" w:sz="4"/>
+              <w:right w:val="single" w:color="D8D8CF" w:sz="4"/>
+            </w:tcBorders>
+            <w:tcMar>
+              <w:top w:type="dxa" w:w="80"/>
+              <w:left w:type="dxa" w:w="100"/>
+              <w:bottom w:type="dxa" w:w="80"/>
+              <w:right w:type="dxa" w:w="100"/>
+            </w:tcMar>
+          </w:tcPr>
+          <w:p>
+            <w:r>
+              <w:t xml:space="preserve">Prolonga a cirurgia para resolver tudo em um só tempo.</w:t>
+            </w:r>
+          </w:p>
+        </w:tc>
+        <w:tc>
+          <w:tcPr>
+            <w:tcW w:type="dxa" w:w="2950"/>
+            <w:tcBorders>
+              <w:top w:val="single" w:color="D8D8CF" w:sz="4"/>
+              <w:left w:val="single" w:color="D8D8CF" w:sz="4"/>
+              <w:bottom w:val="single" w:color="D8D8CF" w:sz="4"/>
+              <w:right w:val="single" w:color="D8D8CF" w:sz="4"/>
+            </w:tcBorders>
+            <w:tcMar>
+              <w:top w:type="dxa" w:w="80"/>
+              <w:left w:type="dxa" w:w="100"/>
+              <w:bottom w:type="dxa" w:w="80"/>
+              <w:right w:type="dxa" w:w="100"/>
+            </w:tcMar>
+          </w:tcPr>
+          <w:p>
+            <w:r>
+              <w:t xml:space="preserve">A cirurgia dura mais duas horas. O paciente chega à UTI com 34,6 °C, pH 7,10 e sangramento difuso, e precisa de transfusão maciça antes da reoperação.</w:t>
+            </w:r>
+          </w:p>
+        </w:tc>
+        <w:tc>
+          <w:tcPr>
+            <w:tcW w:type="dxa" w:w="1969"/>
+            <w:tcBorders>
+              <w:top w:val="single" w:color="D8D8CF" w:sz="4"/>
+              <w:left w:val="single" w:color="D8D8CF" w:sz="4"/>
+              <w:bottom w:val="single" w:color="D8D8CF" w:sz="4"/>
+              <w:right w:val="single" w:color="D8D8CF" w:sz="4"/>
+            </w:tcBorders>
+            <w:tcMar>
+              <w:top w:type="dxa" w:w="80"/>
+              <w:left w:type="dxa" w:w="100"/>
+              <w:bottom w:type="dxa" w:w="80"/>
+              <w:right w:type="dxa" w:w="100"/>
+            </w:tcMar>
+          </w:tcPr>
+          <w:p>
+            <w:r>
+              <w:t xml:space="preserve">Desfecho D3 (ruim)</w:t>
+            </w:r>
+          </w:p>
+        </w:tc>
+      </w:tr>
     </w:tbl>
     <w:p>
       <w:pPr>
@@ -6737,6 +7073,74 @@
           <w:p>
             <w:r>
               <w:t xml:space="preserve">Retorno em choque séptico após alta indevida. Controle de danos, UTI e internação prolongada. Sobrevive, com complicações.</w:t>
+            </w:r>
+          </w:p>
+        </w:tc>
+      </w:tr>
+      <w:tr>
+        <w:tc>
+          <w:tcPr>
+            <w:tcW w:type="dxa" w:w="1376"/>
+            <w:tcBorders>
+              <w:top w:val="single" w:color="D8D8CF" w:sz="4"/>
+              <w:left w:val="single" w:color="D8D8CF" w:sz="4"/>
+              <w:bottom w:val="single" w:color="D8D8CF" w:sz="4"/>
+              <w:right w:val="single" w:color="D8D8CF" w:sz="4"/>
+            </w:tcBorders>
+            <w:tcMar>
+              <w:top w:type="dxa" w:w="80"/>
+              <w:left w:type="dxa" w:w="100"/>
+              <w:bottom w:type="dxa" w:w="80"/>
+              <w:right w:type="dxa" w:w="100"/>
+            </w:tcMar>
+          </w:tcPr>
+          <w:p>
+            <w:r>
+              <w:t xml:space="preserve">D5</w:t>
+            </w:r>
+          </w:p>
+        </w:tc>
+        <w:tc>
+          <w:tcPr>
+            <w:tcW w:type="dxa" w:w="1376"/>
+            <w:tcBorders>
+              <w:top w:val="single" w:color="D8D8CF" w:sz="4"/>
+              <w:left w:val="single" w:color="D8D8CF" w:sz="4"/>
+              <w:bottom w:val="single" w:color="D8D8CF" w:sz="4"/>
+              <w:right w:val="single" w:color="D8D8CF" w:sz="4"/>
+            </w:tcBorders>
+            <w:tcMar>
+              <w:top w:type="dxa" w:w="80"/>
+              <w:left w:type="dxa" w:w="100"/>
+              <w:bottom w:type="dxa" w:w="80"/>
+              <w:right w:type="dxa" w:w="100"/>
+            </w:tcMar>
+          </w:tcPr>
+          <w:p>
+            <w:r>
+              <w:t xml:space="preserve">grave</w:t>
+            </w:r>
+          </w:p>
+        </w:tc>
+        <w:tc>
+          <w:tcPr>
+            <w:tcW w:type="dxa" w:w="6886"/>
+            <w:tcBorders>
+              <w:top w:val="single" w:color="D8D8CF" w:sz="4"/>
+              <w:left w:val="single" w:color="D8D8CF" w:sz="4"/>
+              <w:bottom w:val="single" w:color="D8D8CF" w:sz="4"/>
+              <w:right w:val="single" w:color="D8D8CF" w:sz="4"/>
+            </w:tcBorders>
+            <w:tcMar>
+              <w:top w:type="dxa" w:w="80"/>
+              <w:left w:type="dxa" w:w="100"/>
+              <w:bottom w:type="dxa" w:w="80"/>
+              <w:right w:type="dxa" w:w="100"/>
+            </w:tcMar>
+          </w:tcPr>
+          <w:p>
+            <w:r>
+              <w:t xml:space="preserve">Óbito. A anastomose feita em choque, com acidose e hipotermia, abre no terceiro dia de pós-operatório. O paciente evolui com peritonite, choque séptico refratário e falência de múltiplos órgãos, e morre na UTI.</w:t>
             </w:r>
           </w:p>
         </w:tc>
@@ -7141,7 +7545,7 @@
           </w:tcPr>
           <w:p>
             <w:r>
-              <w:t xml:space="preserve">Série de cortes</w:t>
+              <w:t xml:space="preserve">Imagem única</w:t>
             </w:r>
           </w:p>
         </w:tc>

</xml_diff>